<commit_message>
updated app logo + proifle page username ändern
</commit_message>
<xml_diff>
--- a/Dokumentation/Berichte/Meetingprotokolle/DS_Protokoll_4.docx
+++ b/Dokumentation/Berichte/Meetingprotokolle/DS_Protokoll_4.docx
@@ -88,14 +88,6 @@
         </w:rPr>
         <w:tab/>
       </w:r>
-      <w:r>
-        <w:rPr>
-          <w:sz w:val="28"/>
-          <w:szCs w:val="28"/>
-          <w:lang w:val="en-GB"/>
-        </w:rPr>
-        <w:t>Web -App</w:t>
-      </w:r>
     </w:p>
     <w:p>
       <w:pPr>
@@ -122,13 +114,6 @@
         </w:rPr>
         <w:tab/>
       </w:r>
-      <w:r>
-        <w:rPr>
-          <w:sz w:val="28"/>
-          <w:szCs w:val="28"/>
-        </w:rPr>
-        <w:t>Backend</w:t>
-      </w:r>
     </w:p>
     <w:p>
       <w:pPr>
@@ -162,13 +147,6 @@
         </w:rPr>
         <w:t xml:space="preserve">Protokoll, </w:t>
       </w:r>
-      <w:r>
-        <w:rPr>
-          <w:sz w:val="28"/>
-          <w:szCs w:val="28"/>
-        </w:rPr>
-        <w:t>Git</w:t>
-      </w:r>
     </w:p>
     <w:p>
       <w:pPr>
@@ -194,13 +172,6 @@
           <w:szCs w:val="28"/>
         </w:rPr>
         <w:tab/>
-      </w:r>
-      <w:r>
-        <w:rPr>
-          <w:sz w:val="28"/>
-          <w:szCs w:val="28"/>
-        </w:rPr>
-        <w:t>App</w:t>
       </w:r>
     </w:p>
     <w:p>
@@ -340,6 +311,20 @@
         </w:rPr>
         <w:t xml:space="preserve"> </w:t>
       </w:r>
+      <w:r>
+        <w:rPr>
+          <w:sz w:val="28"/>
+          <w:szCs w:val="28"/>
+        </w:rPr>
+        <w:t>–</w:t>
+      </w:r>
+      <w:r>
+        <w:rPr>
+          <w:sz w:val="28"/>
+          <w:szCs w:val="28"/>
+        </w:rPr>
+        <w:t xml:space="preserve"> </w:t>
+      </w:r>
     </w:p>
     <w:p>
       <w:pPr>
@@ -378,25 +363,6 @@
           <w:szCs w:val="32"/>
         </w:rPr>
         <w:t xml:space="preserve">  </w:t>
-      </w:r>
-    </w:p>
-    <w:p>
-      <w:pPr>
-        <w:tabs>
-          <w:tab w:val="left" w:pos="2835"/>
-        </w:tabs>
-        <w:ind w:left="720"/>
-        <w:rPr>
-          <w:sz w:val="28"/>
-          <w:szCs w:val="28"/>
-        </w:rPr>
-      </w:pPr>
-      <w:r>
-        <w:rPr>
-          <w:sz w:val="28"/>
-          <w:szCs w:val="28"/>
-        </w:rPr>
-        <w:t>Db musste geändert werden</w:t>
       </w:r>
     </w:p>
     <w:p>

</xml_diff>